<commit_message>
docs: address performance runbook review feedback
</commit_message>
<xml_diff>
--- a/WordPress-Performance-Incident-Runbook.docx
+++ b/WordPress-Performance-Incident-Runbook.docx
@@ -1711,6 +1711,39 @@
         </w:rPr>
         <w:t xml:space="preserve">"[CUSTOMIZE: YYYYMMDD-short-name]"</w:t>
       </w:r>
+      <w:r>
+        <w:br/>
+      </w:r>
+      <w:r>
+        <w:rPr>
+          <w:rStyle w:val="BuiltInTok"/>
+        </w:rPr>
+        <w:t xml:space="preserve">export</w:t>
+      </w:r>
+      <w:r>
+        <w:rPr>
+          <w:rStyle w:val="NormalTok"/>
+        </w:rPr>
+        <w:t xml:space="preserve"> </w:t>
+      </w:r>
+      <w:r>
+        <w:rPr>
+          <w:rStyle w:val="VariableTok"/>
+        </w:rPr>
+        <w:t xml:space="preserve">OPTIONS_TABLE</w:t>
+      </w:r>
+      <w:r>
+        <w:rPr>
+          <w:rStyle w:val="OperatorTok"/>
+        </w:rPr>
+        <w:t xml:space="preserve">=</w:t>
+      </w:r>
+      <w:r>
+        <w:rPr>
+          <w:rStyle w:val="StringTok"/>
+        </w:rPr>
+        <w:t xml:space="preserve">"[CUSTOMIZE: wp_options or wp_2_options]"</w:t>
+      </w:r>
     </w:p>
     <w:p>
       <w:pPr>
@@ -1793,6 +1826,51 @@
       </w:r>
       <w:r>
         <w:t xml:space="preserve">to site-specific WP-CLI commands.</w:t>
+      </w:r>
+    </w:p>
+    <w:p>
+      <w:pPr>
+        <w:pStyle w:val="Compact"/>
+        <w:numPr>
+          <w:ilvl w:val="0"/>
+          <w:numId w:val="1011"/>
+        </w:numPr>
+      </w:pPr>
+      <w:r>
+        <w:rPr>
+          <w:rStyle w:val="VerbatimChar"/>
+        </w:rPr>
+        <w:t xml:space="preserve">OPTIONS_TABLE</w:t>
+      </w:r>
+      <w:r>
+        <w:t xml:space="preserve"> </w:t>
+      </w:r>
+      <w:r>
+        <w:t xml:space="preserve">must match the affected site table prefix. For multisite, use the affected blog options table such as</w:t>
+      </w:r>
+      <w:r>
+        <w:t xml:space="preserve"> </w:t>
+      </w:r>
+      <w:r>
+        <w:rPr>
+          <w:rStyle w:val="VerbatimChar"/>
+        </w:rPr>
+        <w:t xml:space="preserve">wp_2_options</w:t>
+      </w:r>
+      <w:r>
+        <w:t xml:space="preserve">, not always</w:t>
+      </w:r>
+      <w:r>
+        <w:t xml:space="preserve"> </w:t>
+      </w:r>
+      <w:r>
+        <w:rPr>
+          <w:rStyle w:val="VerbatimChar"/>
+        </w:rPr>
+        <w:t xml:space="preserve">wp_options</w:t>
+      </w:r>
+      <w:r>
+        <w:t xml:space="preserve">.</w:t>
       </w:r>
     </w:p>
     <w:bookmarkEnd w:id="45"/>
@@ -3633,70 +3711,43 @@
         <w:rPr>
           <w:rStyle w:val="NormalTok"/>
         </w:rPr>
-        <w:t xml:space="preserve"> transient delete </w:t>
+        <w:t xml:space="preserve"> cron event list </w:t>
       </w:r>
       <w:r>
         <w:rPr>
           <w:rStyle w:val="AttributeTok"/>
         </w:rPr>
-        <w:t xml:space="preserve">--expired</w:t>
+        <w:t xml:space="preserve">--due-now</w:t>
       </w:r>
       <w:r>
         <w:br/>
       </w:r>
       <w:r>
-        <w:rPr>
-          <w:rStyle w:val="ExtensionTok"/>
-        </w:rPr>
-        <w:t xml:space="preserve">wp</w:t>
-      </w:r>
-      <w:r>
-        <w:rPr>
-          <w:rStyle w:val="NormalTok"/>
-        </w:rPr>
-        <w:t xml:space="preserve"> </w:t>
-      </w:r>
-      <w:r>
-        <w:rPr>
-          <w:rStyle w:val="AttributeTok"/>
-        </w:rPr>
-        <w:t xml:space="preserve">--path</w:t>
-      </w:r>
-      <w:r>
-        <w:rPr>
-          <w:rStyle w:val="OperatorTok"/>
-        </w:rPr>
-        <w:t xml:space="preserve">=</w:t>
-      </w:r>
-      <w:r>
-        <w:rPr>
-          <w:rStyle w:val="StringTok"/>
-        </w:rPr>
-        <w:t xml:space="preserve">"</w:t>
-      </w:r>
-      <w:r>
-        <w:rPr>
-          <w:rStyle w:val="VariableTok"/>
-        </w:rPr>
-        <w:t xml:space="preserve">$WP_PATH</w:t>
-      </w:r>
-      <w:r>
-        <w:rPr>
-          <w:rStyle w:val="StringTok"/>
-        </w:rPr>
-        <w:t xml:space="preserve">"</w:t>
-      </w:r>
-      <w:r>
-        <w:rPr>
-          <w:rStyle w:val="NormalTok"/>
-        </w:rPr>
-        <w:t xml:space="preserve"> cron event list </w:t>
-      </w:r>
-      <w:r>
-        <w:rPr>
-          <w:rStyle w:val="AttributeTok"/>
-        </w:rPr>
-        <w:t xml:space="preserve">--due-now</w:t>
+        <w:br/>
+      </w:r>
+      <w:r>
+        <w:rPr>
+          <w:rStyle w:val="CommentTok"/>
+        </w:rPr>
+        <w:t xml:space="preserve"># Optional write operation - run only after incident lead approval.</w:t>
+      </w:r>
+      <w:r>
+        <w:br/>
+      </w:r>
+      <w:r>
+        <w:rPr>
+          <w:rStyle w:val="CommentTok"/>
+        </w:rPr>
+        <w:t xml:space="preserve"># This can add database load and remove evidence of transient churn.</w:t>
+      </w:r>
+      <w:r>
+        <w:br/>
+      </w:r>
+      <w:r>
+        <w:rPr>
+          <w:rStyle w:val="CommentTok"/>
+        </w:rPr>
+        <w:t xml:space="preserve"># wp --path="$WP_PATH" transient delete --expired</w:t>
       </w:r>
     </w:p>
     <w:bookmarkEnd w:id="61"/>
@@ -3817,7 +3868,7 @@
         <w:pStyle w:val="FirstParagraph"/>
       </w:pPr>
       <w:r>
-        <w:t xml:space="preserve">No rollback is required for the read-only checks. If an approved cache-rule change is made outside this procedure, restore the previous cache rule from the CDN/host change history.</w:t>
+        <w:t xml:space="preserve">No rollback is required for the default read-only checks. If the optional expired-transient cleanup is approved and run, there is no practical rollback for deleted expired transient rows; rely on application regeneration and continue monitoring. If an approved cache-rule change is made outside this procedure, restore the previous cache rule from the CDN/host change history.</w:t>
       </w:r>
     </w:p>
     <w:bookmarkEnd w:id="63"/>
@@ -5512,7 +5563,19 @@
         <w:rPr>
           <w:rStyle w:val="StringTok"/>
         </w:rPr>
-        <w:t xml:space="preserve">"SELECT option_name, LENGTH(option_value) AS size, autoload FROM wp_options WHERE autoload IN ('yes', 'on', 'auto', 'auto-on') ORDER BY size DESC LIMIT 20;"</w:t>
+        <w:t xml:space="preserve">"SELECT option_name, LENGTH(option_value) AS size, autoload FROM </w:t>
+      </w:r>
+      <w:r>
+        <w:rPr>
+          <w:rStyle w:val="VariableTok"/>
+        </w:rPr>
+        <w:t xml:space="preserve">${OPTIONS_TABLE}</w:t>
+      </w:r>
+      <w:r>
+        <w:rPr>
+          <w:rStyle w:val="StringTok"/>
+        </w:rPr>
+        <w:t xml:space="preserve"> WHERE autoload IN ('yes', 'on', 'auto', 'auto-on') ORDER BY size DESC LIMIT 20;"</w:t>
       </w:r>
       <w:r>
         <w:br/>
@@ -5572,7 +5635,19 @@
         <w:rPr>
           <w:rStyle w:val="StringTok"/>
         </w:rPr>
-        <w:t xml:space="preserve">"SELECT SUM(LENGTH(option_value)) AS autoload_bytes FROM wp_options WHERE autoload IN ('yes', 'on', 'auto', 'auto-on');"</w:t>
+        <w:t xml:space="preserve">"SELECT SUM(LENGTH(option_value)) AS autoload_bytes FROM </w:t>
+      </w:r>
+      <w:r>
+        <w:rPr>
+          <w:rStyle w:val="VariableTok"/>
+        </w:rPr>
+        <w:t xml:space="preserve">${OPTIONS_TABLE}</w:t>
+      </w:r>
+      <w:r>
+        <w:rPr>
+          <w:rStyle w:val="StringTok"/>
+        </w:rPr>
+        <w:t xml:space="preserve"> WHERE autoload IN ('yes', 'on', 'auto', 'auto-on');"</w:t>
       </w:r>
       <w:r>
         <w:br/>
@@ -5815,7 +5890,19 @@
         <w:rPr>
           <w:rStyle w:val="StringTok"/>
         </w:rPr>
-        <w:t xml:space="preserve">"SELECT option_name, autoload FROM wp_options WHERE option_name='[CUSTOMIZE: option_name]';"</w:t>
+        <w:t xml:space="preserve">"SELECT option_name, autoload FROM </w:t>
+      </w:r>
+      <w:r>
+        <w:rPr>
+          <w:rStyle w:val="VariableTok"/>
+        </w:rPr>
+        <w:t xml:space="preserve">${OPTIONS_TABLE}</w:t>
+      </w:r>
+      <w:r>
+        <w:rPr>
+          <w:rStyle w:val="StringTok"/>
+        </w:rPr>
+        <w:t xml:space="preserve"> WHERE option_name='[CUSTOMIZE: option_name]';"</w:t>
       </w:r>
       <w:r>
         <w:br/>
@@ -5959,7 +6046,19 @@
         <w:rPr>
           <w:rStyle w:val="StringTok"/>
         </w:rPr>
-        <w:t xml:space="preserve">"SELECT SUM(LENGTH(option_value)) AS autoload_bytes FROM wp_options WHERE autoload IN ('yes', 'on', 'auto', 'auto-on');"</w:t>
+        <w:t xml:space="preserve">"SELECT SUM(LENGTH(option_value)) AS autoload_bytes FROM </w:t>
+      </w:r>
+      <w:r>
+        <w:rPr>
+          <w:rStyle w:val="VariableTok"/>
+        </w:rPr>
+        <w:t xml:space="preserve">${OPTIONS_TABLE}</w:t>
+      </w:r>
+      <w:r>
+        <w:rPr>
+          <w:rStyle w:val="StringTok"/>
+        </w:rPr>
+        <w:t xml:space="preserve"> WHERE autoload IN ('yes', 'on', 'auto', 'auto-on');"</w:t>
       </w:r>
       <w:r>
         <w:br/>
@@ -6606,57 +6705,27 @@
       </w:r>
       <w:r>
         <w:rPr>
-          <w:rStyle w:val="ExtensionTok"/>
-        </w:rPr>
-        <w:t xml:space="preserve">wp</w:t>
-      </w:r>
-      <w:r>
-        <w:rPr>
-          <w:rStyle w:val="NormalTok"/>
-        </w:rPr>
-        <w:t xml:space="preserve"> </w:t>
-      </w:r>
-      <w:r>
-        <w:rPr>
-          <w:rStyle w:val="AttributeTok"/>
-        </w:rPr>
-        <w:t xml:space="preserve">--path</w:t>
-      </w:r>
-      <w:r>
-        <w:rPr>
-          <w:rStyle w:val="OperatorTok"/>
-        </w:rPr>
-        <w:t xml:space="preserve">=</w:t>
-      </w:r>
-      <w:r>
-        <w:rPr>
-          <w:rStyle w:val="StringTok"/>
-        </w:rPr>
-        <w:t xml:space="preserve">"</w:t>
-      </w:r>
-      <w:r>
-        <w:rPr>
-          <w:rStyle w:val="VariableTok"/>
-        </w:rPr>
-        <w:t xml:space="preserve">$WP_PATH</w:t>
-      </w:r>
-      <w:r>
-        <w:rPr>
-          <w:rStyle w:val="StringTok"/>
-        </w:rPr>
-        <w:t xml:space="preserve">"</w:t>
-      </w:r>
-      <w:r>
-        <w:rPr>
-          <w:rStyle w:val="NormalTok"/>
-        </w:rPr>
-        <w:t xml:space="preserve"> transient delete </w:t>
-      </w:r>
-      <w:r>
-        <w:rPr>
-          <w:rStyle w:val="AttributeTok"/>
-        </w:rPr>
-        <w:t xml:space="preserve">--expired</w:t>
+          <w:rStyle w:val="CommentTok"/>
+        </w:rPr>
+        <w:t xml:space="preserve"># Optional write operation - run only after incident lead approval.</w:t>
+      </w:r>
+      <w:r>
+        <w:br/>
+      </w:r>
+      <w:r>
+        <w:rPr>
+          <w:rStyle w:val="CommentTok"/>
+        </w:rPr>
+        <w:t xml:space="preserve"># This can add database load and remove evidence of transient churn.</w:t>
+      </w:r>
+      <w:r>
+        <w:br/>
+      </w:r>
+      <w:r>
+        <w:rPr>
+          <w:rStyle w:val="CommentTok"/>
+        </w:rPr>
+        <w:t xml:space="preserve"># wp --path="$WP_PATH" transient delete --expired</w:t>
       </w:r>
     </w:p>
     <w:bookmarkEnd w:id="88"/>
@@ -6711,7 +6780,7 @@
         </w:numPr>
       </w:pPr>
       <w:r>
-        <w:t xml:space="preserve">Expired transient cleanup is safe but should not be treated as a primary incident fix.</w:t>
+        <w:t xml:space="preserve">Expired transient cleanup is intentionally not part of the default read-only evidence gathering. If approved, it is only a cleanup action and should not be treated as a primary incident fix.</w:t>
       </w:r>
     </w:p>
     <w:bookmarkEnd w:id="89"/>
@@ -6729,7 +6798,7 @@
         <w:pStyle w:val="FirstParagraph"/>
       </w:pPr>
       <w:r>
-        <w:t xml:space="preserve">Do not flush object cache as rollback. If an approved cache-service restart or configuration change worsens the incident, restore the previous service/configuration state through the hosting/platform control plane.</w:t>
+        <w:t xml:space="preserve">Do not flush object cache as rollback. If optional expired-transient cleanup is approved and run, there is no practical rollback for deleted expired transient rows; rely on application regeneration and continue monitoring. If an approved cache-service restart or configuration change worsens the incident, restore the previous service/configuration state through the hosting/platform control plane.</w:t>
       </w:r>
     </w:p>
     <w:p>

</xml_diff>

<commit_message>
docs: move plugin callout and fix task lists
</commit_message>
<xml_diff>
--- a/WordPress-Performance-Incident-Runbook.docx
+++ b/WordPress-Performance-Incident-Runbook.docx
@@ -26,7 +26,7 @@
         <w:t xml:space="preserve">Dan Knauss, General Editor</w:t>
       </w:r>
     </w:p>
-    <w:bookmarkStart w:id="24" w:name="wordpress-performance-incident-runbook"/>
+    <w:bookmarkStart w:id="44" w:name="wordpress-performance-incident-runbook"/>
     <w:p>
       <w:pPr>
         <w:pStyle w:val="Heading1"/>
@@ -141,7 +141,7 @@
           <w:numId w:val="1001"/>
         </w:numPr>
       </w:pPr>
-      <w:hyperlink r:id="rId20">
+      <w:hyperlink r:id="rId40">
         <w:r>
           <w:rPr>
             <w:rStyle w:val="VerbatimChar"/>
@@ -164,7 +164,7 @@
           <w:numId w:val="1001"/>
         </w:numPr>
       </w:pPr>
-      <w:hyperlink r:id="rId21">
+      <w:hyperlink r:id="rId41">
         <w:r>
           <w:rPr>
             <w:rStyle w:val="VerbatimChar"/>
@@ -187,7 +187,7 @@
           <w:numId w:val="1001"/>
         </w:numPr>
       </w:pPr>
-      <w:hyperlink r:id="rId22">
+      <w:hyperlink r:id="rId42">
         <w:r>
           <w:rPr>
             <w:rStyle w:val="VerbatimChar"/>
@@ -210,7 +210,7 @@
           <w:numId w:val="1001"/>
         </w:numPr>
       </w:pPr>
-      <w:hyperlink r:id="rId23">
+      <w:hyperlink r:id="rId43">
         <w:r>
           <w:rPr>
             <w:rStyle w:val="VerbatimChar"/>
@@ -225,8 +225,8 @@
         <w:t xml:space="preserve">explains transients, persistent object cache behavior, and cache-stampede risk.</w:t>
       </w:r>
     </w:p>
-    <w:bookmarkEnd w:id="24"/>
-    <w:bookmarkStart w:id="104" w:name="table-of-contents"/>
+    <w:bookmarkEnd w:id="44"/>
+    <w:bookmarkStart w:id="124" w:name="table-of-contents"/>
     <w:p>
       <w:pPr>
         <w:pStyle w:val="Heading1"/>
@@ -1578,7 +1578,7 @@
         </w:r>
       </w:hyperlink>
     </w:p>
-    <w:bookmarkStart w:id="25" w:name="environment-placeholders"/>
+    <w:bookmarkStart w:id="45" w:name="environment-placeholders"/>
     <w:p>
       <w:pPr>
         <w:pStyle w:val="Heading2"/>
@@ -2514,8 +2514,8 @@
         <w:t xml:space="preserve">for the selected site and verified before raw SQL is used. For network-wide checks, label the command as network-wide before running it.</w:t>
       </w:r>
     </w:p>
-    <w:bookmarkEnd w:id="25"/>
-    <w:bookmarkStart w:id="26" w:name="severity-triggers"/>
+    <w:bookmarkEnd w:id="45"/>
+    <w:bookmarkStart w:id="46" w:name="severity-triggers"/>
     <w:p>
       <w:pPr>
         <w:pStyle w:val="Heading2"/>
@@ -2680,8 +2680,8 @@
         </w:tc>
       </w:tr>
     </w:tbl>
-    <w:bookmarkEnd w:id="26"/>
-    <w:bookmarkStart w:id="27" w:name="communications-cadence"/>
+    <w:bookmarkEnd w:id="46"/>
+    <w:bookmarkStart w:id="47" w:name="communications-cadence"/>
     <w:p>
       <w:pPr>
         <w:pStyle w:val="Heading2"/>
@@ -2762,8 +2762,8 @@
         <w:t xml:space="preserve">Channels: [CUSTOMIZE: incident channel, status page, customer-support channel, executive/internal update path].</w:t>
       </w:r>
     </w:p>
-    <w:bookmarkEnd w:id="27"/>
-    <w:bookmarkStart w:id="28" w:name="safety-rules"/>
+    <w:bookmarkEnd w:id="47"/>
+    <w:bookmarkStart w:id="48" w:name="safety-rules"/>
     <w:p>
       <w:pPr>
         <w:pStyle w:val="Heading2"/>
@@ -2844,8 +2844,8 @@
         <w:t xml:space="preserve">Preserve evidence: save command output, timestamps, and before/after measurements.</w:t>
       </w:r>
     </w:p>
-    <w:bookmarkEnd w:id="28"/>
-    <w:bookmarkStart w:id="29" w:name="first-10-minutes"/>
+    <w:bookmarkEnd w:id="48"/>
+    <w:bookmarkStart w:id="49" w:name="first-10-minutes"/>
     <w:p>
       <w:pPr>
         <w:pStyle w:val="Heading2"/>
@@ -2945,8 +2945,8 @@
         </w:pict>
       </w:r>
     </w:p>
-    <w:bookmarkEnd w:id="29"/>
-    <w:bookmarkStart w:id="38" w:name="X2972ce79a225ec9e67bb45a8282f22384452f4e"/>
+    <w:bookmarkEnd w:id="49"/>
+    <w:bookmarkStart w:id="58" w:name="X2972ce79a225ec9e67bb45a8282f22384452f4e"/>
     <w:p>
       <w:pPr>
         <w:pStyle w:val="Heading2"/>
@@ -2955,7 +2955,7 @@
         <w:t xml:space="preserve">Procedure 1: Initial performance incident triage</w:t>
       </w:r>
     </w:p>
-    <w:bookmarkStart w:id="30" w:name="procedure-metadata"/>
+    <w:bookmarkStart w:id="50" w:name="procedure-metadata"/>
     <w:p>
       <w:pPr>
         <w:pStyle w:val="Heading3"/>
@@ -3024,8 +3024,8 @@
         <w:t xml:space="preserve">Last Drill Date: [CUSTOMIZE: YYYY-MM-DD / N/A]</w:t>
       </w:r>
     </w:p>
-    <w:bookmarkEnd w:id="30"/>
-    <w:bookmarkStart w:id="31" w:name="purpose"/>
+    <w:bookmarkEnd w:id="50"/>
+    <w:bookmarkStart w:id="51" w:name="purpose"/>
     <w:p>
       <w:pPr>
         <w:pStyle w:val="Heading3"/>
@@ -3042,8 +3042,8 @@
         <w:t xml:space="preserve">Establish the incident scope, preserve evidence, and decide which deeper procedure to run next.</w:t>
       </w:r>
     </w:p>
-    <w:bookmarkEnd w:id="31"/>
-    <w:bookmarkStart w:id="32" w:name="prerequisites"/>
+    <w:bookmarkEnd w:id="51"/>
+    <w:bookmarkStart w:id="52" w:name="prerequisites"/>
     <w:p>
       <w:pPr>
         <w:pStyle w:val="Heading3"/>
@@ -3100,8 +3100,8 @@
         <w:t xml:space="preserve">Known affected URL, known-good URL, and expected user state: anonymous, logged-in, admin, REST, AJAX, cron, or checkout/account.</w:t>
       </w:r>
     </w:p>
-    <w:bookmarkEnd w:id="32"/>
-    <w:bookmarkStart w:id="33" w:name="commands"/>
+    <w:bookmarkEnd w:id="52"/>
+    <w:bookmarkStart w:id="53" w:name="commands"/>
     <w:p>
       <w:pPr>
         <w:pStyle w:val="Heading3"/>
@@ -3919,8 +3919,8 @@
         <w:t xml:space="preserve"> option get home</w:t>
       </w:r>
     </w:p>
-    <w:bookmarkEnd w:id="33"/>
-    <w:bookmarkStart w:id="34" w:name="expected-output"/>
+    <w:bookmarkEnd w:id="53"/>
+    <w:bookmarkStart w:id="54" w:name="expected-output"/>
     <w:p>
       <w:pPr>
         <w:pStyle w:val="Heading3"/>
@@ -4022,8 +4022,8 @@
         <w:t xml:space="preserve">WP-CLI returns the WordPress version and expected site URLs.</w:t>
       </w:r>
     </w:p>
-    <w:bookmarkEnd w:id="34"/>
-    <w:bookmarkStart w:id="35" w:name="rollback"/>
+    <w:bookmarkEnd w:id="54"/>
+    <w:bookmarkStart w:id="55" w:name="rollback"/>
     <w:p>
       <w:pPr>
         <w:pStyle w:val="Heading3"/>
@@ -4040,8 +4040,8 @@
         <w:t xml:space="preserve">No rollback is required. This procedure is read-only.</w:t>
       </w:r>
     </w:p>
-    <w:bookmarkEnd w:id="35"/>
-    <w:bookmarkStart w:id="36" w:name="verification"/>
+    <w:bookmarkEnd w:id="55"/>
+    <w:bookmarkStart w:id="56" w:name="verification"/>
     <w:p>
       <w:pPr>
         <w:pStyle w:val="Heading3"/>
@@ -4306,8 +4306,8 @@
         <w:t xml:space="preserve">Expected: both checks print success messages.</w:t>
       </w:r>
     </w:p>
-    <w:bookmarkEnd w:id="36"/>
-    <w:bookmarkStart w:id="37" w:name="escalate-if"/>
+    <w:bookmarkEnd w:id="56"/>
+    <w:bookmarkStart w:id="57" w:name="escalate-if"/>
     <w:p>
       <w:pPr>
         <w:pStyle w:val="Heading3"/>
@@ -4359,9 +4359,9 @@
         </w:pict>
       </w:r>
     </w:p>
-    <w:bookmarkEnd w:id="37"/>
-    <w:bookmarkEnd w:id="38"/>
-    <w:bookmarkStart w:id="47" w:name="X83746c02efcb7355199d36e3bbf2b98118bf50d"/>
+    <w:bookmarkEnd w:id="57"/>
+    <w:bookmarkEnd w:id="58"/>
+    <w:bookmarkStart w:id="67" w:name="X83746c02efcb7355199d36e3bbf2b98118bf50d"/>
     <w:p>
       <w:pPr>
         <w:pStyle w:val="Heading2"/>
@@ -4370,7 +4370,7 @@
         <w:t xml:space="preserve">Procedure 2: High TTFB on anonymous public pages</w:t>
       </w:r>
     </w:p>
-    <w:bookmarkStart w:id="39" w:name="procedure-metadata-1"/>
+    <w:bookmarkStart w:id="59" w:name="procedure-metadata-1"/>
     <w:p>
       <w:pPr>
         <w:pStyle w:val="Heading3"/>
@@ -4439,8 +4439,8 @@
         <w:t xml:space="preserve">Last Drill Date: [CUSTOMIZE: YYYY-MM-DD / N/A]</w:t>
       </w:r>
     </w:p>
-    <w:bookmarkEnd w:id="39"/>
-    <w:bookmarkStart w:id="40" w:name="purpose-1"/>
+    <w:bookmarkEnd w:id="59"/>
+    <w:bookmarkStart w:id="60" w:name="purpose-1"/>
     <w:p>
       <w:pPr>
         <w:pStyle w:val="Heading3"/>
@@ -4457,8 +4457,8 @@
         <w:t xml:space="preserve">Determine whether high anonymous-page TTFB is caused by cache miss/bypass, transport/edge delay, origin/PHP execution, database work, object-cache misses, or external dependencies.</w:t>
       </w:r>
     </w:p>
-    <w:bookmarkEnd w:id="40"/>
-    <w:bookmarkStart w:id="41" w:name="prerequisites-1"/>
+    <w:bookmarkEnd w:id="60"/>
+    <w:bookmarkStart w:id="61" w:name="prerequisites-1"/>
     <w:p>
       <w:pPr>
         <w:pStyle w:val="Heading3"/>
@@ -4503,8 +4503,8 @@
         <w:t xml:space="preserve">Permission to inspect cache rules and origin metrics.</w:t>
       </w:r>
     </w:p>
-    <w:bookmarkEnd w:id="41"/>
-    <w:bookmarkStart w:id="42" w:name="commands-1"/>
+    <w:bookmarkEnd w:id="61"/>
+    <w:bookmarkStart w:id="62" w:name="commands-1"/>
     <w:p>
       <w:pPr>
         <w:pStyle w:val="Heading3"/>
@@ -4992,8 +4992,8 @@
         <w:t xml:space="preserve"># wp "${WP_CLI_SITE_ARGS[@]}" transient delete --expired</w:t>
       </w:r>
     </w:p>
-    <w:bookmarkEnd w:id="42"/>
-    <w:bookmarkStart w:id="43" w:name="expected-output-1"/>
+    <w:bookmarkEnd w:id="62"/>
+    <w:bookmarkStart w:id="63" w:name="expected-output-1"/>
     <w:p>
       <w:pPr>
         <w:pStyle w:val="Heading3"/>
@@ -5095,8 +5095,8 @@
         <w:t xml:space="preserve">on anonymous cacheable pages is a red flag because it can fragment or bypass HTML cache.</w:t>
       </w:r>
     </w:p>
-    <w:bookmarkEnd w:id="43"/>
-    <w:bookmarkStart w:id="44" w:name="rollback-1"/>
+    <w:bookmarkEnd w:id="63"/>
+    <w:bookmarkStart w:id="64" w:name="rollback-1"/>
     <w:p>
       <w:pPr>
         <w:pStyle w:val="Heading3"/>
@@ -5113,8 +5113,8 @@
         <w:t xml:space="preserve">No rollback is required for the default read-only checks. If the optional expired-transient cleanup is approved and run, there is no practical rollback for deleted expired transient rows; rely on application regeneration and continue monitoring. If an approved cache-rule change is made outside this procedure, restore the previous cache rule from the CDN/host change history.</w:t>
       </w:r>
     </w:p>
-    <w:bookmarkEnd w:id="44"/>
-    <w:bookmarkStart w:id="45" w:name="verification-1"/>
+    <w:bookmarkEnd w:id="64"/>
+    <w:bookmarkStart w:id="65" w:name="verification-1"/>
     <w:p>
       <w:pPr>
         <w:pStyle w:val="Heading3"/>
@@ -5424,8 +5424,8 @@
         <w:t xml:space="preserve">Expected: cacheable anonymous pages show an intentional cache status and improved TTFB after warming.</w:t>
       </w:r>
     </w:p>
-    <w:bookmarkEnd w:id="45"/>
-    <w:bookmarkStart w:id="46" w:name="escalate-if-1"/>
+    <w:bookmarkEnd w:id="65"/>
+    <w:bookmarkStart w:id="66" w:name="escalate-if-1"/>
     <w:p>
       <w:pPr>
         <w:pStyle w:val="Heading3"/>
@@ -5489,9 +5489,9 @@
         </w:pict>
       </w:r>
     </w:p>
-    <w:bookmarkEnd w:id="46"/>
-    <w:bookmarkEnd w:id="47"/>
-    <w:bookmarkStart w:id="56" w:name="Xc78eb344ec27429bb25e7513b2e40832aa38ddf"/>
+    <w:bookmarkEnd w:id="66"/>
+    <w:bookmarkEnd w:id="67"/>
+    <w:bookmarkStart w:id="76" w:name="Xc78eb344ec27429bb25e7513b2e40832aa38ddf"/>
     <w:p>
       <w:pPr>
         <w:pStyle w:val="Heading2"/>
@@ -5500,7 +5500,7 @@
         <w:t xml:space="preserve">Procedure 3: High TTFB on logged-in, admin, REST, or AJAX requests</w:t>
       </w:r>
     </w:p>
-    <w:bookmarkStart w:id="48" w:name="procedure-metadata-2"/>
+    <w:bookmarkStart w:id="68" w:name="procedure-metadata-2"/>
     <w:p>
       <w:pPr>
         <w:pStyle w:val="Heading3"/>
@@ -5569,8 +5569,8 @@
         <w:t xml:space="preserve">Last Drill Date: [CUSTOMIZE: YYYY-MM-DD / N/A]</w:t>
       </w:r>
     </w:p>
-    <w:bookmarkEnd w:id="48"/>
-    <w:bookmarkStart w:id="49" w:name="purpose-2"/>
+    <w:bookmarkEnd w:id="68"/>
+    <w:bookmarkStart w:id="69" w:name="purpose-2"/>
     <w:p>
       <w:pPr>
         <w:pStyle w:val="Heading3"/>
@@ -5587,8 +5587,8 @@
         <w:t xml:space="preserve">Diagnose slow dynamic requests that cannot be solved by public full-page caching.</w:t>
       </w:r>
     </w:p>
-    <w:bookmarkEnd w:id="49"/>
-    <w:bookmarkStart w:id="50" w:name="prerequisites-2"/>
+    <w:bookmarkEnd w:id="69"/>
+    <w:bookmarkStart w:id="70" w:name="prerequisites-2"/>
     <w:p>
       <w:pPr>
         <w:pStyle w:val="Heading3"/>
@@ -5648,8 +5648,8 @@
         <w:t xml:space="preserve">WP-CLI profile and doctor packages may not be installed; check availability before relying on them.</w:t>
       </w:r>
     </w:p>
-    <w:bookmarkEnd w:id="50"/>
-    <w:bookmarkStart w:id="51" w:name="commands-2"/>
+    <w:bookmarkEnd w:id="70"/>
+    <w:bookmarkStart w:id="71" w:name="commands-2"/>
     <w:p>
       <w:pPr>
         <w:pStyle w:val="Heading3"/>
@@ -6392,8 +6392,8 @@
         <w:t xml:space="preserve">active</w:t>
       </w:r>
     </w:p>
-    <w:bookmarkEnd w:id="51"/>
-    <w:bookmarkStart w:id="52" w:name="expected-output-2"/>
+    <w:bookmarkEnd w:id="71"/>
+    <w:bookmarkStart w:id="72" w:name="expected-output-2"/>
     <w:p>
       <w:pPr>
         <w:pStyle w:val="Heading3"/>
@@ -6477,8 +6477,8 @@
         <w:t xml:space="preserve">Active plugin/theme inventory supports rollback and ownership decisions.</w:t>
       </w:r>
     </w:p>
-    <w:bookmarkEnd w:id="52"/>
-    <w:bookmarkStart w:id="53" w:name="rollback-2"/>
+    <w:bookmarkEnd w:id="72"/>
+    <w:bookmarkStart w:id="73" w:name="rollback-2"/>
     <w:p>
       <w:pPr>
         <w:pStyle w:val="Heading3"/>
@@ -6495,8 +6495,8 @@
         <w:t xml:space="preserve">No rollback is required for profiling. If an approved mitigation disables a plugin/module or changes configuration, restore the previous plugin/configuration state from the incident log or deployment system.</w:t>
       </w:r>
     </w:p>
-    <w:bookmarkEnd w:id="53"/>
-    <w:bookmarkStart w:id="54" w:name="verification-2"/>
+    <w:bookmarkEnd w:id="73"/>
+    <w:bookmarkStart w:id="74" w:name="verification-2"/>
     <w:p>
       <w:pPr>
         <w:pStyle w:val="Heading3"/>
@@ -6995,8 +6995,8 @@
         <w:t xml:space="preserve">Expected: TTFB and total time improve for the same URL, user state, authentication method, and expected HTTP status/body marker, or the dominant bottleneck is identified for escalation.</w:t>
       </w:r>
     </w:p>
-    <w:bookmarkEnd w:id="54"/>
-    <w:bookmarkStart w:id="55" w:name="escalate-if-2"/>
+    <w:bookmarkEnd w:id="74"/>
+    <w:bookmarkStart w:id="75" w:name="escalate-if-2"/>
     <w:p>
       <w:pPr>
         <w:pStyle w:val="Heading3"/>
@@ -7060,9 +7060,9 @@
         </w:pict>
       </w:r>
     </w:p>
-    <w:bookmarkEnd w:id="55"/>
-    <w:bookmarkEnd w:id="56"/>
-    <w:bookmarkStart w:id="65" w:name="X78d9c4b3fea6ba66ffeacb2d31c1711612d8c1b"/>
+    <w:bookmarkEnd w:id="75"/>
+    <w:bookmarkEnd w:id="76"/>
+    <w:bookmarkStart w:id="85" w:name="X78d9c4b3fea6ba66ffeacb2d31c1711612d8c1b"/>
     <w:p>
       <w:pPr>
         <w:pStyle w:val="Heading2"/>
@@ -7071,7 +7071,7 @@
         <w:t xml:space="preserve">Procedure 4: Database slowdown, autoload bloat, or expensive queries</w:t>
       </w:r>
     </w:p>
-    <w:bookmarkStart w:id="57" w:name="procedure-metadata-3"/>
+    <w:bookmarkStart w:id="77" w:name="procedure-metadata-3"/>
     <w:p>
       <w:pPr>
         <w:pStyle w:val="Heading3"/>
@@ -7140,8 +7140,8 @@
         <w:t xml:space="preserve">Last Drill Date: [CUSTOMIZE: YYYY-MM-DD / N/A]</w:t>
       </w:r>
     </w:p>
-    <w:bookmarkEnd w:id="57"/>
-    <w:bookmarkStart w:id="58" w:name="purpose-3"/>
+    <w:bookmarkEnd w:id="77"/>
+    <w:bookmarkStart w:id="78" w:name="purpose-3"/>
     <w:p>
       <w:pPr>
         <w:pStyle w:val="Heading3"/>
@@ -7158,8 +7158,8 @@
         <w:t xml:space="preserve">Identify whether database time is dominated by slow queries, too many queries, inefficient query shape, or autoloaded option bloat.</w:t>
       </w:r>
     </w:p>
-    <w:bookmarkEnd w:id="58"/>
-    <w:bookmarkStart w:id="59" w:name="prerequisites-3"/>
+    <w:bookmarkEnd w:id="78"/>
+    <w:bookmarkStart w:id="79" w:name="prerequisites-3"/>
     <w:p>
       <w:pPr>
         <w:pStyle w:val="Heading3"/>
@@ -7204,8 +7204,8 @@
         <w:t xml:space="preserve">Current backup/snapshot before any write operation.</w:t>
       </w:r>
     </w:p>
-    <w:bookmarkEnd w:id="59"/>
-    <w:bookmarkStart w:id="60" w:name="commands-3"/>
+    <w:bookmarkEnd w:id="79"/>
+    <w:bookmarkStart w:id="80" w:name="commands-3"/>
     <w:p>
       <w:pPr>
         <w:pStyle w:val="Heading3"/>
@@ -7417,8 +7417,8 @@
         <w:t xml:space="preserve">--tables</w:t>
       </w:r>
     </w:p>
-    <w:bookmarkEnd w:id="60"/>
-    <w:bookmarkStart w:id="61" w:name="expected-output-3"/>
+    <w:bookmarkEnd w:id="80"/>
+    <w:bookmarkStart w:id="81" w:name="expected-output-3"/>
     <w:p>
       <w:pPr>
         <w:pStyle w:val="Heading3"/>
@@ -7514,8 +7514,8 @@
         <w:t xml:space="preserve">Large tables are identified for deeper query review.</w:t>
       </w:r>
     </w:p>
-    <w:bookmarkEnd w:id="61"/>
-    <w:bookmarkStart w:id="62" w:name="rollback-3"/>
+    <w:bookmarkEnd w:id="81"/>
+    <w:bookmarkStart w:id="82" w:name="rollback-3"/>
     <w:p>
       <w:pPr>
         <w:pStyle w:val="Heading3"/>
@@ -7633,8 +7633,8 @@
         <w:t xml:space="preserve"># wp "${WP_CLI_SITE_ARGS[@]}" option set-autoload "[CUSTOMIZE: option_name]" on</w:t>
       </w:r>
     </w:p>
-    <w:bookmarkEnd w:id="62"/>
-    <w:bookmarkStart w:id="63" w:name="verification-3"/>
+    <w:bookmarkEnd w:id="82"/>
+    <w:bookmarkStart w:id="83" w:name="verification-3"/>
     <w:p>
       <w:pPr>
         <w:pStyle w:val="Heading3"/>
@@ -7920,8 +7920,8 @@
         <w:t xml:space="preserve">Expected: autoload footprint decreases if that was the target, and the affected request improves without functional regression.</w:t>
       </w:r>
     </w:p>
-    <w:bookmarkEnd w:id="63"/>
-    <w:bookmarkStart w:id="64" w:name="escalate-if-3"/>
+    <w:bookmarkEnd w:id="83"/>
+    <w:bookmarkStart w:id="84" w:name="escalate-if-3"/>
     <w:p>
       <w:pPr>
         <w:pStyle w:val="Heading3"/>
@@ -7997,9 +7997,9 @@
         </w:pict>
       </w:r>
     </w:p>
-    <w:bookmarkEnd w:id="64"/>
-    <w:bookmarkEnd w:id="65"/>
-    <w:bookmarkStart w:id="74" w:name="Xf57d3723339981668969bd6c50405868f5f0541"/>
+    <w:bookmarkEnd w:id="84"/>
+    <w:bookmarkEnd w:id="85"/>
+    <w:bookmarkStart w:id="94" w:name="Xf57d3723339981668969bd6c50405868f5f0541"/>
     <w:p>
       <w:pPr>
         <w:pStyle w:val="Heading2"/>
@@ -8008,7 +8008,7 @@
         <w:t xml:space="preserve">Procedure 5: Object cache failure or cache stampede</w:t>
       </w:r>
     </w:p>
-    <w:bookmarkStart w:id="66" w:name="procedure-metadata-4"/>
+    <w:bookmarkStart w:id="86" w:name="procedure-metadata-4"/>
     <w:p>
       <w:pPr>
         <w:pStyle w:val="Heading3"/>
@@ -8077,8 +8077,8 @@
         <w:t xml:space="preserve">Last Drill Date: [CUSTOMIZE: YYYY-MM-DD / N/A]</w:t>
       </w:r>
     </w:p>
-    <w:bookmarkEnd w:id="66"/>
-    <w:bookmarkStart w:id="67" w:name="purpose-4"/>
+    <w:bookmarkEnd w:id="86"/>
+    <w:bookmarkStart w:id="87" w:name="purpose-4"/>
     <w:p>
       <w:pPr>
         <w:pStyle w:val="Heading3"/>
@@ -8095,8 +8095,8 @@
         <w:t xml:space="preserve">Determine whether a persistent object cache failure, poor hit rate, key misuse, or cache stampede is causing origin/database overload.</w:t>
       </w:r>
     </w:p>
-    <w:bookmarkEnd w:id="67"/>
-    <w:bookmarkStart w:id="68" w:name="prerequisites-4"/>
+    <w:bookmarkEnd w:id="87"/>
+    <w:bookmarkStart w:id="88" w:name="prerequisites-4"/>
     <w:p>
       <w:pPr>
         <w:pStyle w:val="Heading3"/>
@@ -8141,8 +8141,8 @@
         <w:t xml:space="preserve">Approval before restarting cache services or flushing object cache.</w:t>
       </w:r>
     </w:p>
-    <w:bookmarkEnd w:id="68"/>
-    <w:bookmarkStart w:id="69" w:name="commands-4"/>
+    <w:bookmarkEnd w:id="88"/>
+    <w:bookmarkStart w:id="89" w:name="commands-4"/>
     <w:p>
       <w:pPr>
         <w:pStyle w:val="Heading3"/>
@@ -8441,8 +8441,8 @@
         <w:t xml:space="preserve"># wp "${WP_CLI_SITE_ARGS[@]}" transient delete --expired</w:t>
       </w:r>
     </w:p>
-    <w:bookmarkEnd w:id="69"/>
-    <w:bookmarkStart w:id="70" w:name="expected-output-4"/>
+    <w:bookmarkEnd w:id="89"/>
+    <w:bookmarkStart w:id="90" w:name="expected-output-4"/>
     <w:p>
       <w:pPr>
         <w:pStyle w:val="Heading3"/>
@@ -8496,8 +8496,8 @@
         <w:t xml:space="preserve">Expired transient cleanup is intentionally not part of the default read-only evidence gathering. If approved, it is only a cleanup action and should not be treated as a primary incident fix.</w:t>
       </w:r>
     </w:p>
-    <w:bookmarkEnd w:id="70"/>
-    <w:bookmarkStart w:id="71" w:name="rollback-4"/>
+    <w:bookmarkEnd w:id="90"/>
+    <w:bookmarkStart w:id="91" w:name="rollback-4"/>
     <w:p>
       <w:pPr>
         <w:pStyle w:val="Heading3"/>
@@ -8552,8 +8552,8 @@
         <w:t xml:space="preserve"># wp "${WP_CLI_SITE_ARGS[@]}" redis disable</w:t>
       </w:r>
     </w:p>
-    <w:bookmarkEnd w:id="71"/>
-    <w:bookmarkStart w:id="72" w:name="verification-4"/>
+    <w:bookmarkEnd w:id="91"/>
+    <w:bookmarkStart w:id="92" w:name="verification-4"/>
     <w:p>
       <w:pPr>
         <w:pStyle w:val="Heading3"/>
@@ -8767,8 +8767,8 @@
         <w:t xml:space="preserve">Expected: database load, cache errors, or TTFB improve after the approved mitigation.</w:t>
       </w:r>
     </w:p>
-    <w:bookmarkEnd w:id="72"/>
-    <w:bookmarkStart w:id="73" w:name="escalate-if-4"/>
+    <w:bookmarkEnd w:id="92"/>
+    <w:bookmarkStart w:id="93" w:name="escalate-if-4"/>
     <w:p>
       <w:pPr>
         <w:pStyle w:val="Heading3"/>
@@ -8856,9 +8856,9 @@
         </w:pict>
       </w:r>
     </w:p>
-    <w:bookmarkEnd w:id="73"/>
-    <w:bookmarkEnd w:id="74"/>
-    <w:bookmarkStart w:id="83" w:name="Xadcb7e5d04c1ad327e3c6b4ab2c3a924786c591"/>
+    <w:bookmarkEnd w:id="93"/>
+    <w:bookmarkEnd w:id="94"/>
+    <w:bookmarkStart w:id="103" w:name="Xadcb7e5d04c1ad327e3c6b4ab2c3a924786c591"/>
     <w:p>
       <w:pPr>
         <w:pStyle w:val="Heading2"/>
@@ -8867,7 +8867,7 @@
         <w:t xml:space="preserve">Procedure 6: WP-Cron or Action Scheduler backlog</w:t>
       </w:r>
     </w:p>
-    <w:bookmarkStart w:id="75" w:name="procedure-metadata-5"/>
+    <w:bookmarkStart w:id="95" w:name="procedure-metadata-5"/>
     <w:p>
       <w:pPr>
         <w:pStyle w:val="Heading3"/>
@@ -8936,8 +8936,8 @@
         <w:t xml:space="preserve">Last Drill Date: [CUSTOMIZE: YYYY-MM-DD / N/A]</w:t>
       </w:r>
     </w:p>
-    <w:bookmarkEnd w:id="75"/>
-    <w:bookmarkStart w:id="76" w:name="purpose-5"/>
+    <w:bookmarkEnd w:id="95"/>
+    <w:bookmarkStart w:id="96" w:name="purpose-5"/>
     <w:p>
       <w:pPr>
         <w:pStyle w:val="Heading3"/>
@@ -8954,8 +8954,8 @@
         <w:t xml:space="preserve">Identify whether due cron events, failed scheduled actions, or overlapping background jobs are causing request-time latency or delayed business workflows.</w:t>
       </w:r>
     </w:p>
-    <w:bookmarkEnd w:id="76"/>
-    <w:bookmarkStart w:id="77" w:name="prerequisites-5"/>
+    <w:bookmarkEnd w:id="96"/>
+    <w:bookmarkStart w:id="97" w:name="prerequisites-5"/>
     <w:p>
       <w:pPr>
         <w:pStyle w:val="Heading3"/>
@@ -9000,8 +9000,8 @@
         <w:t xml:space="preserve">Knowledge of whether WooCommerce or Action Scheduler is active.</w:t>
       </w:r>
     </w:p>
-    <w:bookmarkEnd w:id="77"/>
-    <w:bookmarkStart w:id="78" w:name="commands-5"/>
+    <w:bookmarkEnd w:id="97"/>
+    <w:bookmarkStart w:id="98" w:name="commands-5"/>
     <w:p>
       <w:pPr>
         <w:pStyle w:val="Heading3"/>
@@ -9168,8 +9168,8 @@
         <w:t xml:space="preserve"># wp "${WP_CLI_SITE_ARGS[@]}" action-scheduler list --status=failed --per-page=20</w:t>
       </w:r>
     </w:p>
-    <w:bookmarkEnd w:id="78"/>
-    <w:bookmarkStart w:id="79" w:name="expected-output-5"/>
+    <w:bookmarkEnd w:id="98"/>
+    <w:bookmarkStart w:id="99" w:name="expected-output-5"/>
     <w:p>
       <w:pPr>
         <w:pStyle w:val="Heading3"/>
@@ -9214,8 +9214,8 @@
         <w:t xml:space="preserve">Failed Action Scheduler jobs identify plugin/business workflow ownership.</w:t>
       </w:r>
     </w:p>
-    <w:bookmarkEnd w:id="79"/>
-    <w:bookmarkStart w:id="80" w:name="rollback-5"/>
+    <w:bookmarkEnd w:id="99"/>
+    <w:bookmarkStart w:id="100" w:name="rollback-5"/>
     <w:p>
       <w:pPr>
         <w:pStyle w:val="Heading3"/>
@@ -9267,8 +9267,8 @@
         <w:t xml:space="preserve">// define( 'DISABLE_WP_CRON', true );</w:t>
       </w:r>
     </w:p>
-    <w:bookmarkEnd w:id="80"/>
-    <w:bookmarkStart w:id="81" w:name="verification-5"/>
+    <w:bookmarkEnd w:id="100"/>
+    <w:bookmarkStart w:id="101" w:name="verification-5"/>
     <w:p>
       <w:pPr>
         <w:pStyle w:val="Heading3"/>
@@ -9401,8 +9401,8 @@
         <w:t xml:space="preserve">Expected: read-only verification shows whether due events are decreasing under the normal runner. If approved cron execution is run, due events decrease or clear and business workflows such as scheduled posts, cleanup jobs, and ecommerce queues resume.</w:t>
       </w:r>
     </w:p>
-    <w:bookmarkEnd w:id="81"/>
-    <w:bookmarkStart w:id="82" w:name="escalate-if-5"/>
+    <w:bookmarkEnd w:id="101"/>
+    <w:bookmarkStart w:id="102" w:name="escalate-if-5"/>
     <w:p>
       <w:pPr>
         <w:pStyle w:val="Heading3"/>
@@ -9466,9 +9466,9 @@
         </w:pict>
       </w:r>
     </w:p>
-    <w:bookmarkEnd w:id="82"/>
-    <w:bookmarkEnd w:id="83"/>
-    <w:bookmarkStart w:id="92" w:name="X2b923f659648e52476e7d8f6178e9bedd6d19bc"/>
+    <w:bookmarkEnd w:id="102"/>
+    <w:bookmarkEnd w:id="103"/>
+    <w:bookmarkStart w:id="112" w:name="X2b923f659648e52476e7d8f6178e9bedd6d19bc"/>
     <w:p>
       <w:pPr>
         <w:pStyle w:val="Heading2"/>
@@ -9477,7 +9477,7 @@
         <w:t xml:space="preserve">Procedure 7: External API, AI connector, or third-party latency</w:t>
       </w:r>
     </w:p>
-    <w:bookmarkStart w:id="84" w:name="procedure-metadata-6"/>
+    <w:bookmarkStart w:id="104" w:name="procedure-metadata-6"/>
     <w:p>
       <w:pPr>
         <w:pStyle w:val="Heading3"/>
@@ -9546,8 +9546,8 @@
         <w:t xml:space="preserve">Last Drill Date: [CUSTOMIZE: YYYY-MM-DD / N/A]</w:t>
       </w:r>
     </w:p>
-    <w:bookmarkEnd w:id="84"/>
-    <w:bookmarkStart w:id="85" w:name="purpose-6"/>
+    <w:bookmarkEnd w:id="104"/>
+    <w:bookmarkStart w:id="105" w:name="purpose-6"/>
     <w:p>
       <w:pPr>
         <w:pStyle w:val="Heading3"/>
@@ -9564,8 +9564,8 @@
         <w:t xml:space="preserve">Identify whether external HTTP calls, WordPress 7.0 AI/connectors integrations, payment/search/CRM APIs, analytics, or embed providers are slowing critical requests.</w:t>
       </w:r>
     </w:p>
-    <w:bookmarkEnd w:id="85"/>
-    <w:bookmarkStart w:id="86" w:name="prerequisites-6"/>
+    <w:bookmarkEnd w:id="105"/>
+    <w:bookmarkStart w:id="106" w:name="prerequisites-6"/>
     <w:p>
       <w:pPr>
         <w:pStyle w:val="Heading3"/>
@@ -9610,8 +9610,8 @@
         <w:t xml:space="preserve">A safe fallback or feature flag is identified before disabling integrations.</w:t>
       </w:r>
     </w:p>
-    <w:bookmarkEnd w:id="86"/>
-    <w:bookmarkStart w:id="87" w:name="commands-6"/>
+    <w:bookmarkEnd w:id="106"/>
+    <w:bookmarkStart w:id="107" w:name="commands-6"/>
     <w:p>
       <w:pPr>
         <w:pStyle w:val="Heading3"/>
@@ -9907,8 +9907,8 @@
         <w:t xml:space="preserve">"</w:t>
       </w:r>
     </w:p>
-    <w:bookmarkEnd w:id="87"/>
-    <w:bookmarkStart w:id="88" w:name="expected-output-6"/>
+    <w:bookmarkEnd w:id="107"/>
+    <w:bookmarkStart w:id="108" w:name="expected-output-6"/>
     <w:p>
       <w:pPr>
         <w:pStyle w:val="Heading3"/>
@@ -9953,8 +9953,8 @@
         <w:t xml:space="preserve">APM traces, if available, should separate HTTP API time from PHP, database, and cache time.</w:t>
       </w:r>
     </w:p>
-    <w:bookmarkEnd w:id="88"/>
-    <w:bookmarkStart w:id="89" w:name="rollback-6"/>
+    <w:bookmarkEnd w:id="108"/>
+    <w:bookmarkStart w:id="109" w:name="rollback-6"/>
     <w:p>
       <w:pPr>
         <w:pStyle w:val="Heading3"/>
@@ -10000,8 +10000,8 @@
         <w:t xml:space="preserve"># wp "${WP_CLI_SITE_ARGS[@]}" option update "[CUSTOMIZE: option_name]" "[CUSTOMIZE: previous_value]"</w:t>
       </w:r>
     </w:p>
-    <w:bookmarkEnd w:id="89"/>
-    <w:bookmarkStart w:id="90" w:name="verification-6"/>
+    <w:bookmarkEnd w:id="109"/>
+    <w:bookmarkStart w:id="110" w:name="verification-6"/>
     <w:p>
       <w:pPr>
         <w:pStyle w:val="Heading3"/>
@@ -10215,8 +10215,8 @@
         <w:t xml:space="preserve">Expected: request time improves or APM confirms the external dependency is no longer in the critical path.</w:t>
       </w:r>
     </w:p>
-    <w:bookmarkEnd w:id="90"/>
-    <w:bookmarkStart w:id="91" w:name="escalate-if-6"/>
+    <w:bookmarkEnd w:id="110"/>
+    <w:bookmarkStart w:id="111" w:name="escalate-if-6"/>
     <w:p>
       <w:pPr>
         <w:pStyle w:val="Heading3"/>
@@ -10280,9 +10280,9 @@
         </w:pict>
       </w:r>
     </w:p>
-    <w:bookmarkEnd w:id="91"/>
-    <w:bookmarkEnd w:id="92"/>
-    <w:bookmarkStart w:id="101" w:name="procedure-8-core-web-vitals-regression"/>
+    <w:bookmarkEnd w:id="111"/>
+    <w:bookmarkEnd w:id="112"/>
+    <w:bookmarkStart w:id="121" w:name="procedure-8-core-web-vitals-regression"/>
     <w:p>
       <w:pPr>
         <w:pStyle w:val="Heading2"/>
@@ -10291,7 +10291,7 @@
         <w:t xml:space="preserve">Procedure 8: Core Web Vitals regression</w:t>
       </w:r>
     </w:p>
-    <w:bookmarkStart w:id="93" w:name="procedure-metadata-7"/>
+    <w:bookmarkStart w:id="113" w:name="procedure-metadata-7"/>
     <w:p>
       <w:pPr>
         <w:pStyle w:val="Heading3"/>
@@ -10360,8 +10360,8 @@
         <w:t xml:space="preserve">Last Drill Date: [CUSTOMIZE: YYYY-MM-DD / N/A]</w:t>
       </w:r>
     </w:p>
-    <w:bookmarkEnd w:id="93"/>
-    <w:bookmarkStart w:id="94" w:name="purpose-7"/>
+    <w:bookmarkEnd w:id="113"/>
+    <w:bookmarkStart w:id="114" w:name="purpose-7"/>
     <w:p>
       <w:pPr>
         <w:pStyle w:val="Heading3"/>
@@ -10378,8 +10378,8 @@
         <w:t xml:space="preserve">Triage a user-facing LCP, INP, or CLS regression without confusing frontend symptoms with backend, cache, or transport causes.</w:t>
       </w:r>
     </w:p>
-    <w:bookmarkEnd w:id="94"/>
-    <w:bookmarkStart w:id="95" w:name="prerequisites-7"/>
+    <w:bookmarkEnd w:id="114"/>
+    <w:bookmarkStart w:id="115" w:name="prerequisites-7"/>
     <w:p>
       <w:pPr>
         <w:pStyle w:val="Heading3"/>
@@ -10424,8 +10424,8 @@
         <w:t xml:space="preserve">Browser tooling may be required for final diagnosis; if unavailable, capture backend/transport evidence first and escalate for browser inspection with requested artifacts: DevTools trace, Lighthouse or WebPageTest report, RUM segment, device/viewport class, and before/after screenshots when visual instability is involved.</w:t>
       </w:r>
     </w:p>
-    <w:bookmarkEnd w:id="95"/>
-    <w:bookmarkStart w:id="96" w:name="commands-7"/>
+    <w:bookmarkEnd w:id="115"/>
+    <w:bookmarkStart w:id="116" w:name="commands-7"/>
     <w:p>
       <w:pPr>
         <w:pStyle w:val="Heading3"/>
@@ -10727,8 +10727,8 @@
         <w:t xml:space="preserve">true</w:t>
       </w:r>
     </w:p>
-    <w:bookmarkEnd w:id="96"/>
-    <w:bookmarkStart w:id="97" w:name="expected-output-7"/>
+    <w:bookmarkEnd w:id="116"/>
+    <w:bookmarkStart w:id="117" w:name="expected-output-7"/>
     <w:p>
       <w:pPr>
         <w:pStyle w:val="Heading3"/>
@@ -10773,8 +10773,8 @@
         <w:t xml:space="preserve">Further LCP/INP/CLS diagnosis usually requires browser traces, RUM, lab tooling, device/viewport segmentation, and screenshots for visual instability.</w:t>
       </w:r>
     </w:p>
-    <w:bookmarkEnd w:id="97"/>
-    <w:bookmarkStart w:id="98" w:name="rollback-7"/>
+    <w:bookmarkEnd w:id="117"/>
+    <w:bookmarkStart w:id="118" w:name="rollback-7"/>
     <w:p>
       <w:pPr>
         <w:pStyle w:val="Heading3"/>
@@ -10791,8 +10791,8 @@
         <w:t xml:space="preserve">If the regression follows a deploy, rollback through the normal release system after incident lead approval. If it follows a CDN/cache/optimization plugin change, restore the previous configuration.</w:t>
       </w:r>
     </w:p>
-    <w:bookmarkEnd w:id="98"/>
-    <w:bookmarkStart w:id="99" w:name="verification-7"/>
+    <w:bookmarkEnd w:id="118"/>
+    <w:bookmarkStart w:id="119" w:name="verification-7"/>
     <w:p>
       <w:pPr>
         <w:pStyle w:val="Heading3"/>
@@ -11006,8 +11006,8 @@
         <w:t xml:space="preserve">Expected: backend/transport signals are healthy before handing off to browser-level investigation; after frontend mitigation, field or lab metrics improve for the same template/device class.</w:t>
       </w:r>
     </w:p>
-    <w:bookmarkEnd w:id="99"/>
-    <w:bookmarkStart w:id="100" w:name="escalate-if-7"/>
+    <w:bookmarkEnd w:id="119"/>
+    <w:bookmarkStart w:id="120" w:name="escalate-if-7"/>
     <w:p>
       <w:pPr>
         <w:pStyle w:val="Heading3"/>
@@ -11071,9 +11071,9 @@
         </w:pict>
       </w:r>
     </w:p>
-    <w:bookmarkEnd w:id="100"/>
-    <w:bookmarkEnd w:id="101"/>
-    <w:bookmarkStart w:id="102" w:name="recovery-verification-checklist"/>
+    <w:bookmarkEnd w:id="120"/>
+    <w:bookmarkEnd w:id="121"/>
+    <w:bookmarkStart w:id="122" w:name="recovery-verification-checklist"/>
     <w:p>
       <w:pPr>
         <w:pStyle w:val="Heading2"/>
@@ -11091,83 +11091,83 @@
         </w:numPr>
       </w:pPr>
       <w:r>
-        <w:t xml:space="preserve">[ ] Same URL, same user state, and same cache state were tested before and after mitigation.</w:t>
-      </w:r>
-    </w:p>
-    <w:p>
-      <w:pPr>
-        <w:pStyle w:val="Compact"/>
-        <w:numPr>
-          <w:ilvl w:val="0"/>
-          <w:numId w:val="1047"/>
-        </w:numPr>
-      </w:pPr>
-      <w:r>
-        <w:t xml:space="preserve">[ ] Public cache behavior is intentional and safe.</w:t>
-      </w:r>
-    </w:p>
-    <w:p>
-      <w:pPr>
-        <w:pStyle w:val="Compact"/>
-        <w:numPr>
-          <w:ilvl w:val="0"/>
-          <w:numId w:val="1047"/>
-        </w:numPr>
-      </w:pPr>
-      <w:r>
-        <w:t xml:space="preserve">[ ] Authenticated, personalized, checkout, account, admin, preview, and REST/AJAX paths still behave correctly.</w:t>
-      </w:r>
-    </w:p>
-    <w:p>
-      <w:pPr>
-        <w:pStyle w:val="Compact"/>
-        <w:numPr>
-          <w:ilvl w:val="0"/>
-          <w:numId w:val="1047"/>
-        </w:numPr>
-      </w:pPr>
-      <w:r>
-        <w:t xml:space="preserve">[ ] PHP errors, database errors, and cache-service errors are not increasing.</w:t>
-      </w:r>
-    </w:p>
-    <w:p>
-      <w:pPr>
-        <w:pStyle w:val="Compact"/>
-        <w:numPr>
-          <w:ilvl w:val="0"/>
-          <w:numId w:val="1047"/>
-        </w:numPr>
-      </w:pPr>
-      <w:r>
-        <w:t xml:space="preserve">[ ] Cron and queues are clearing if they were part of the incident.</w:t>
-      </w:r>
-    </w:p>
-    <w:p>
-      <w:pPr>
-        <w:pStyle w:val="Compact"/>
-        <w:numPr>
-          <w:ilvl w:val="0"/>
-          <w:numId w:val="1047"/>
-        </w:numPr>
-      </w:pPr>
-      <w:r>
-        <w:t xml:space="preserve">[ ] APM/RUM/headers/logs show recovery, not just one successful manual request.</w:t>
-      </w:r>
-    </w:p>
-    <w:p>
-      <w:pPr>
-        <w:pStyle w:val="Compact"/>
-        <w:numPr>
-          <w:ilvl w:val="0"/>
-          <w:numId w:val="1047"/>
-        </w:numPr>
-      </w:pPr>
-      <w:r>
-        <w:t xml:space="preserve">[ ] Stakeholders know what changed, what remains under watch, and when the next update or closeout will happen.</w:t>
-      </w:r>
-    </w:p>
-    <w:bookmarkEnd w:id="102"/>
-    <w:bookmarkStart w:id="103" w:name="post-incident-follow-up"/>
+        <w:t xml:space="preserve">Same URL, same user state, and same cache state were tested before and after mitigation.</w:t>
+      </w:r>
+    </w:p>
+    <w:p>
+      <w:pPr>
+        <w:pStyle w:val="Compact"/>
+        <w:numPr>
+          <w:ilvl w:val="0"/>
+          <w:numId w:val="1048"/>
+        </w:numPr>
+      </w:pPr>
+      <w:r>
+        <w:t xml:space="preserve">Public cache behavior is intentional and safe.</w:t>
+      </w:r>
+    </w:p>
+    <w:p>
+      <w:pPr>
+        <w:pStyle w:val="Compact"/>
+        <w:numPr>
+          <w:ilvl w:val="0"/>
+          <w:numId w:val="1049"/>
+        </w:numPr>
+      </w:pPr>
+      <w:r>
+        <w:t xml:space="preserve">Authenticated, personalized, checkout, account, admin, preview, and REST/AJAX paths still behave correctly.</w:t>
+      </w:r>
+    </w:p>
+    <w:p>
+      <w:pPr>
+        <w:pStyle w:val="Compact"/>
+        <w:numPr>
+          <w:ilvl w:val="0"/>
+          <w:numId w:val="1050"/>
+        </w:numPr>
+      </w:pPr>
+      <w:r>
+        <w:t xml:space="preserve">PHP errors, database errors, and cache-service errors are not increasing.</w:t>
+      </w:r>
+    </w:p>
+    <w:p>
+      <w:pPr>
+        <w:pStyle w:val="Compact"/>
+        <w:numPr>
+          <w:ilvl w:val="0"/>
+          <w:numId w:val="1051"/>
+        </w:numPr>
+      </w:pPr>
+      <w:r>
+        <w:t xml:space="preserve">Cron and queues are clearing if they were part of the incident.</w:t>
+      </w:r>
+    </w:p>
+    <w:p>
+      <w:pPr>
+        <w:pStyle w:val="Compact"/>
+        <w:numPr>
+          <w:ilvl w:val="0"/>
+          <w:numId w:val="1052"/>
+        </w:numPr>
+      </w:pPr>
+      <w:r>
+        <w:t xml:space="preserve">APM/RUM/headers/logs show recovery, not just one successful manual request.</w:t>
+      </w:r>
+    </w:p>
+    <w:p>
+      <w:pPr>
+        <w:pStyle w:val="Compact"/>
+        <w:numPr>
+          <w:ilvl w:val="0"/>
+          <w:numId w:val="1053"/>
+        </w:numPr>
+      </w:pPr>
+      <w:r>
+        <w:t xml:space="preserve">Stakeholders know what changed, what remains under watch, and when the next update or closeout will happen.</w:t>
+      </w:r>
+    </w:p>
+    <w:bookmarkEnd w:id="122"/>
+    <w:bookmarkStart w:id="123" w:name="post-incident-follow-up"/>
     <w:p>
       <w:pPr>
         <w:pStyle w:val="Heading2"/>
@@ -11181,65 +11181,65 @@
         <w:pStyle w:val="Compact"/>
         <w:numPr>
           <w:ilvl w:val="0"/>
-          <w:numId w:val="1048"/>
-        </w:numPr>
-      </w:pPr>
-      <w:r>
-        <w:t xml:space="preserve">[ ] Write a short timeline with symptoms, trigger, detection, mitigation, stakeholder communications, and verification.</w:t>
-      </w:r>
-    </w:p>
-    <w:p>
-      <w:pPr>
-        <w:pStyle w:val="Compact"/>
-        <w:numPr>
-          <w:ilvl w:val="0"/>
-          <w:numId w:val="1048"/>
-        </w:numPr>
-      </w:pPr>
-      <w:r>
-        <w:t xml:space="preserve">[ ] Open follow-up issues for root-cause fixes that were not safe during the incident.</w:t>
-      </w:r>
-    </w:p>
-    <w:p>
-      <w:pPr>
-        <w:pStyle w:val="Compact"/>
-        <w:numPr>
-          <w:ilvl w:val="0"/>
-          <w:numId w:val="1048"/>
-        </w:numPr>
-      </w:pPr>
-      <w:r>
-        <w:t xml:space="preserve">[ ] Add or tune alerts for the earliest reliable signal.</w:t>
-      </w:r>
-    </w:p>
-    <w:p>
-      <w:pPr>
-        <w:pStyle w:val="Compact"/>
-        <w:numPr>
-          <w:ilvl w:val="0"/>
-          <w:numId w:val="1048"/>
-        </w:numPr>
-      </w:pPr>
-      <w:r>
-        <w:t xml:space="preserve">[ ] Review cache rules, object-cache health, slow queries, cron schedules, and external dependencies touched during the incident.</w:t>
-      </w:r>
-    </w:p>
-    <w:p>
-      <w:pPr>
-        <w:pStyle w:val="Compact"/>
-        <w:numPr>
-          <w:ilvl w:val="0"/>
-          <w:numId w:val="1048"/>
-        </w:numPr>
-      </w:pPr>
-      <w:r>
-        <w:t xml:space="preserve">[ ] Update this runbook if responders had to improvise.</w:t>
-      </w:r>
-    </w:p>
-    <w:bookmarkEnd w:id="103"/>
-    <w:bookmarkEnd w:id="104"/>
+          <w:numId w:val="1054"/>
+        </w:numPr>
+      </w:pPr>
+      <w:r>
+        <w:t xml:space="preserve">Write a short timeline with symptoms, trigger, detection, mitigation, stakeholder communications, and verification.</w:t>
+      </w:r>
+    </w:p>
+    <w:p>
+      <w:pPr>
+        <w:pStyle w:val="Compact"/>
+        <w:numPr>
+          <w:ilvl w:val="0"/>
+          <w:numId w:val="1055"/>
+        </w:numPr>
+      </w:pPr>
+      <w:r>
+        <w:t xml:space="preserve">Open follow-up issues for root-cause fixes that were not safe during the incident.</w:t>
+      </w:r>
+    </w:p>
+    <w:p>
+      <w:pPr>
+        <w:pStyle w:val="Compact"/>
+        <w:numPr>
+          <w:ilvl w:val="0"/>
+          <w:numId w:val="1056"/>
+        </w:numPr>
+      </w:pPr>
+      <w:r>
+        <w:t xml:space="preserve">Add or tune alerts for the earliest reliable signal.</w:t>
+      </w:r>
+    </w:p>
+    <w:p>
+      <w:pPr>
+        <w:pStyle w:val="Compact"/>
+        <w:numPr>
+          <w:ilvl w:val="0"/>
+          <w:numId w:val="1057"/>
+        </w:numPr>
+      </w:pPr>
+      <w:r>
+        <w:t xml:space="preserve">Review cache rules, object-cache health, slow queries, cron schedules, and external dependencies touched during the incident.</w:t>
+      </w:r>
+    </w:p>
+    <w:p>
+      <w:pPr>
+        <w:pStyle w:val="Compact"/>
+        <w:numPr>
+          <w:ilvl w:val="0"/>
+          <w:numId w:val="1058"/>
+        </w:numPr>
+      </w:pPr>
+      <w:r>
+        <w:t xml:space="preserve">Update this runbook if responders had to improvise.</w:t>
+      </w:r>
+    </w:p>
+    <w:bookmarkEnd w:id="123"/>
+    <w:bookmarkEnd w:id="124"/>
     <w:sectPr>
-      <w:footerReference r:id="rId9" w:type="default"/>
+      <w:footerReference r:id="rId31" w:type="default"/>
       <w:footnotePr>
         <w:numRestart w:val="eachSect"/>
       </w:footnotePr>
@@ -11557,6 +11557,82 @@
       <w:start w:val="1"/>
       <w:numFmt w:val="decimal"/>
       <w:lvlText w:val="%9."/>
+      <w:lvlJc w:val="left"/>
+      <w:pPr>
+        <w:ind w:left="6480" w:hanging="360"/>
+      </w:pPr>
+    </w:lvl>
+  </w:abstractNum>
+  <w:abstractNum w:abstractNumId="992">
+    <w:nsid w:val="0000A992"/>
+    <w:multiLevelType w:val="multilevel"/>
+    <w:lvl w:ilvl="0">
+      <w:numFmt w:val="bullet"/>
+      <w:lvlText w:val="☐"/>
+      <w:lvlJc w:val="left"/>
+      <w:pPr>
+        <w:ind w:left="720" w:hanging="360"/>
+      </w:pPr>
+    </w:lvl>
+    <w:lvl w:ilvl="1">
+      <w:numFmt w:val="bullet"/>
+      <w:lvlText w:val="☐"/>
+      <w:lvlJc w:val="left"/>
+      <w:pPr>
+        <w:ind w:left="1440" w:hanging="360"/>
+      </w:pPr>
+    </w:lvl>
+    <w:lvl w:ilvl="2">
+      <w:numFmt w:val="bullet"/>
+      <w:lvlText w:val="☐"/>
+      <w:lvlJc w:val="left"/>
+      <w:pPr>
+        <w:ind w:left="2160" w:hanging="360"/>
+      </w:pPr>
+    </w:lvl>
+    <w:lvl w:ilvl="3">
+      <w:numFmt w:val="bullet"/>
+      <w:lvlText w:val="☐"/>
+      <w:lvlJc w:val="left"/>
+      <w:pPr>
+        <w:ind w:left="2880" w:hanging="360"/>
+      </w:pPr>
+    </w:lvl>
+    <w:lvl w:ilvl="4">
+      <w:numFmt w:val="bullet"/>
+      <w:lvlText w:val="☐"/>
+      <w:lvlJc w:val="left"/>
+      <w:pPr>
+        <w:ind w:left="3600" w:hanging="360"/>
+      </w:pPr>
+    </w:lvl>
+    <w:lvl w:ilvl="5">
+      <w:numFmt w:val="bullet"/>
+      <w:lvlText w:val="☐"/>
+      <w:lvlJc w:val="left"/>
+      <w:pPr>
+        <w:ind w:left="4320" w:hanging="360"/>
+      </w:pPr>
+    </w:lvl>
+    <w:lvl w:ilvl="6">
+      <w:numFmt w:val="bullet"/>
+      <w:lvlText w:val="☐"/>
+      <w:lvlJc w:val="left"/>
+      <w:pPr>
+        <w:ind w:left="5040" w:hanging="360"/>
+      </w:pPr>
+    </w:lvl>
+    <w:lvl w:ilvl="7">
+      <w:numFmt w:val="bullet"/>
+      <w:lvlText w:val="☐"/>
+      <w:lvlJc w:val="left"/>
+      <w:pPr>
+        <w:ind w:left="5760" w:hanging="360"/>
+      </w:pPr>
+    </w:lvl>
+    <w:lvl w:ilvl="8">
+      <w:numFmt w:val="bullet"/>
+      <w:lvlText w:val="☐"/>
       <w:lvlJc w:val="left"/>
       <w:pPr>
         <w:ind w:left="6480" w:hanging="360"/>
@@ -11732,10 +11808,40 @@
     <w:abstractNumId w:val="991"/>
   </w:num>
   <w:num w:numId="1047">
-    <w:abstractNumId w:val="991"/>
+    <w:abstractNumId w:val="992"/>
   </w:num>
   <w:num w:numId="1048">
-    <w:abstractNumId w:val="991"/>
+    <w:abstractNumId w:val="992"/>
+  </w:num>
+  <w:num w:numId="1049">
+    <w:abstractNumId w:val="992"/>
+  </w:num>
+  <w:num w:numId="1050">
+    <w:abstractNumId w:val="992"/>
+  </w:num>
+  <w:num w:numId="1051">
+    <w:abstractNumId w:val="992"/>
+  </w:num>
+  <w:num w:numId="1052">
+    <w:abstractNumId w:val="992"/>
+  </w:num>
+  <w:num w:numId="1053">
+    <w:abstractNumId w:val="992"/>
+  </w:num>
+  <w:num w:numId="1054">
+    <w:abstractNumId w:val="992"/>
+  </w:num>
+  <w:num w:numId="1055">
+    <w:abstractNumId w:val="992"/>
+  </w:num>
+  <w:num w:numId="1056">
+    <w:abstractNumId w:val="992"/>
+  </w:num>
+  <w:num w:numId="1057">
+    <w:abstractNumId w:val="992"/>
+  </w:num>
+  <w:num w:numId="1058">
+    <w:abstractNumId w:val="992"/>
   </w:num>
 </w:numbering>
 </file>

</xml_diff>